<commit_message>
help file and about box update update with issues report
</commit_message>
<xml_diff>
--- a/help.docx
+++ b/help.docx
@@ -162,6 +162,12 @@
     </w:p>
     <w:sdt>
       <w:sdtPr>
+        <w:rPr>
+          <w:rFonts w:asciiTheme="minorHAnsi" w:eastAsiaTheme="minorHAnsi" w:hAnsiTheme="minorHAnsi" w:cstheme="minorBidi"/>
+          <w:color w:val="auto"/>
+          <w:sz w:val="22"/>
+          <w:szCs w:val="22"/>
+        </w:rPr>
         <w:id w:val="-1304627018"/>
         <w:docPartObj>
           <w:docPartGallery w:val="Table of Contents"/>
@@ -170,13 +176,9 @@
       </w:sdtPr>
       <w:sdtEndPr>
         <w:rPr>
-          <w:rFonts w:asciiTheme="minorHAnsi" w:eastAsiaTheme="minorHAnsi" w:hAnsiTheme="minorHAnsi" w:cstheme="minorBidi"/>
           <w:b/>
           <w:bCs/>
           <w:noProof/>
-          <w:color w:val="auto"/>
-          <w:sz w:val="22"/>
-          <w:szCs w:val="22"/>
         </w:rPr>
       </w:sdtEndPr>
       <w:sdtContent>
@@ -217,7 +219,7 @@
           <w:r>
             <w:fldChar w:fldCharType="separate"/>
           </w:r>
-          <w:hyperlink w:anchor="_Toc205197959" w:history="1">
+          <w:hyperlink w:anchor="_Toc205199513" w:history="1">
             <w:r>
               <w:rPr>
                 <w:rStyle w:val="Hyperlink"/>
@@ -241,7 +243,7 @@
               <w:rPr>
                 <w:webHidden/>
               </w:rPr>
-              <w:instrText xml:space="preserve"> PAGEREF _Toc205197959 \h </w:instrText>
+              <w:instrText xml:space="preserve"> PAGEREF _Toc205199513 \h </w:instrText>
             </w:r>
             <w:r>
               <w:rPr>
@@ -282,7 +284,7 @@
               <w14:ligatures w14:val="standardContextual"/>
             </w:rPr>
           </w:pPr>
-          <w:hyperlink w:anchor="_Toc205197960" w:history="1">
+          <w:hyperlink w:anchor="_Toc205199514" w:history="1">
             <w:r>
               <w:rPr>
                 <w:rStyle w:val="Hyperlink"/>
@@ -306,7 +308,7 @@
               <w:rPr>
                 <w:webHidden/>
               </w:rPr>
-              <w:instrText xml:space="preserve"> PAGEREF _Toc205197960 \h </w:instrText>
+              <w:instrText xml:space="preserve"> PAGEREF _Toc205199514 \h </w:instrText>
             </w:r>
             <w:r>
               <w:rPr>
@@ -347,7 +349,7 @@
               <w14:ligatures w14:val="standardContextual"/>
             </w:rPr>
           </w:pPr>
-          <w:hyperlink w:anchor="_Toc205197961" w:history="1">
+          <w:hyperlink w:anchor="_Toc205199515" w:history="1">
             <w:r>
               <w:rPr>
                 <w:rStyle w:val="Hyperlink"/>
@@ -371,7 +373,7 @@
               <w:rPr>
                 <w:webHidden/>
               </w:rPr>
-              <w:instrText xml:space="preserve"> PAGEREF _Toc205197961 \h </w:instrText>
+              <w:instrText xml:space="preserve"> PAGEREF _Toc205199515 \h </w:instrText>
             </w:r>
             <w:r>
               <w:rPr>
@@ -412,7 +414,7 @@
               <w14:ligatures w14:val="standardContextual"/>
             </w:rPr>
           </w:pPr>
-          <w:hyperlink w:anchor="_Toc205197962" w:history="1">
+          <w:hyperlink w:anchor="_Toc205199516" w:history="1">
             <w:r>
               <w:rPr>
                 <w:rStyle w:val="Hyperlink"/>
@@ -436,7 +438,7 @@
               <w:rPr>
                 <w:webHidden/>
               </w:rPr>
-              <w:instrText xml:space="preserve"> PAGEREF _Toc205197962 \h </w:instrText>
+              <w:instrText xml:space="preserve"> PAGEREF _Toc205199516 \h </w:instrText>
             </w:r>
             <w:r>
               <w:rPr>
@@ -477,7 +479,7 @@
               <w14:ligatures w14:val="standardContextual"/>
             </w:rPr>
           </w:pPr>
-          <w:hyperlink w:anchor="_Toc205197963" w:history="1">
+          <w:hyperlink w:anchor="_Toc205199517" w:history="1">
             <w:r>
               <w:rPr>
                 <w:rStyle w:val="Hyperlink"/>
@@ -501,7 +503,7 @@
               <w:rPr>
                 <w:webHidden/>
               </w:rPr>
-              <w:instrText xml:space="preserve"> PAGEREF _Toc205197963 \h </w:instrText>
+              <w:instrText xml:space="preserve"> PAGEREF _Toc205199517 \h </w:instrText>
             </w:r>
             <w:r>
               <w:rPr>
@@ -542,7 +544,7 @@
               <w14:ligatures w14:val="standardContextual"/>
             </w:rPr>
           </w:pPr>
-          <w:hyperlink w:anchor="_Toc205197964" w:history="1">
+          <w:hyperlink w:anchor="_Toc205199518" w:history="1">
             <w:r>
               <w:rPr>
                 <w:rStyle w:val="Hyperlink"/>
@@ -566,7 +568,7 @@
               <w:rPr>
                 <w:webHidden/>
               </w:rPr>
-              <w:instrText xml:space="preserve"> PAGEREF _Toc205197964 \h </w:instrText>
+              <w:instrText xml:space="preserve"> PAGEREF _Toc205199518 \h </w:instrText>
             </w:r>
             <w:r>
               <w:rPr>
@@ -607,7 +609,7 @@
               <w14:ligatures w14:val="standardContextual"/>
             </w:rPr>
           </w:pPr>
-          <w:hyperlink w:anchor="_Toc205197965" w:history="1">
+          <w:hyperlink w:anchor="_Toc205199519" w:history="1">
             <w:r>
               <w:rPr>
                 <w:rStyle w:val="Hyperlink"/>
@@ -631,7 +633,7 @@
               <w:rPr>
                 <w:webHidden/>
               </w:rPr>
-              <w:instrText xml:space="preserve"> PAGEREF _Toc205197965 \h </w:instrText>
+              <w:instrText xml:space="preserve"> PAGEREF _Toc205199519 \h </w:instrText>
             </w:r>
             <w:r>
               <w:rPr>
@@ -672,7 +674,7 @@
               <w14:ligatures w14:val="standardContextual"/>
             </w:rPr>
           </w:pPr>
-          <w:hyperlink w:anchor="_Toc205197966" w:history="1">
+          <w:hyperlink w:anchor="_Toc205199520" w:history="1">
             <w:r>
               <w:rPr>
                 <w:rStyle w:val="Hyperlink"/>
@@ -696,7 +698,7 @@
               <w:rPr>
                 <w:webHidden/>
               </w:rPr>
-              <w:instrText xml:space="preserve"> PAGEREF _Toc205197966 \h </w:instrText>
+              <w:instrText xml:space="preserve"> PAGEREF _Toc205199520 \h </w:instrText>
             </w:r>
             <w:r>
               <w:rPr>
@@ -737,7 +739,7 @@
               <w14:ligatures w14:val="standardContextual"/>
             </w:rPr>
           </w:pPr>
-          <w:hyperlink w:anchor="_Toc205197967" w:history="1">
+          <w:hyperlink w:anchor="_Toc205199521" w:history="1">
             <w:r>
               <w:rPr>
                 <w:rStyle w:val="Hyperlink"/>
@@ -761,7 +763,7 @@
               <w:rPr>
                 <w:webHidden/>
               </w:rPr>
-              <w:instrText xml:space="preserve"> PAGEREF _Toc205197967 \h </w:instrText>
+              <w:instrText xml:space="preserve"> PAGEREF _Toc205199521 \h </w:instrText>
             </w:r>
             <w:r>
               <w:rPr>
@@ -803,7 +805,7 @@
               <w14:ligatures w14:val="standardContextual"/>
             </w:rPr>
           </w:pPr>
-          <w:hyperlink w:anchor="_Toc205197968" w:history="1">
+          <w:hyperlink w:anchor="_Toc205199522" w:history="1">
             <w:r>
               <w:rPr>
                 <w:rStyle w:val="Hyperlink"/>
@@ -831,7 +833,7 @@
                 <w:noProof/>
                 <w:webHidden/>
               </w:rPr>
-              <w:instrText xml:space="preserve"> PAGEREF _Toc205197968 \h </w:instrText>
+              <w:instrText xml:space="preserve"> PAGEREF _Toc205199522 \h </w:instrText>
             </w:r>
             <w:r>
               <w:rPr>
@@ -877,7 +879,7 @@
               <w14:ligatures w14:val="standardContextual"/>
             </w:rPr>
           </w:pPr>
-          <w:hyperlink w:anchor="_Toc205197969" w:history="1">
+          <w:hyperlink w:anchor="_Toc205199523" w:history="1">
             <w:r>
               <w:rPr>
                 <w:rStyle w:val="Hyperlink"/>
@@ -905,7 +907,7 @@
                 <w:noProof/>
                 <w:webHidden/>
               </w:rPr>
-              <w:instrText xml:space="preserve"> PAGEREF _Toc205197969 \h </w:instrText>
+              <w:instrText xml:space="preserve"> PAGEREF _Toc205199523 \h </w:instrText>
             </w:r>
             <w:r>
               <w:rPr>
@@ -950,7 +952,7 @@
               <w14:ligatures w14:val="standardContextual"/>
             </w:rPr>
           </w:pPr>
-          <w:hyperlink w:anchor="_Toc205197970" w:history="1">
+          <w:hyperlink w:anchor="_Toc205199524" w:history="1">
             <w:r>
               <w:rPr>
                 <w:rStyle w:val="Hyperlink"/>
@@ -974,7 +976,7 @@
               <w:rPr>
                 <w:webHidden/>
               </w:rPr>
-              <w:instrText xml:space="preserve"> PAGEREF _Toc205197970 \h </w:instrText>
+              <w:instrText xml:space="preserve"> PAGEREF _Toc205199524 \h </w:instrText>
             </w:r>
             <w:r>
               <w:rPr>
@@ -1016,7 +1018,7 @@
               <w14:ligatures w14:val="standardContextual"/>
             </w:rPr>
           </w:pPr>
-          <w:hyperlink w:anchor="_Toc205197971" w:history="1">
+          <w:hyperlink w:anchor="_Toc205199525" w:history="1">
             <w:r>
               <w:rPr>
                 <w:rStyle w:val="Hyperlink"/>
@@ -1044,7 +1046,7 @@
                 <w:noProof/>
                 <w:webHidden/>
               </w:rPr>
-              <w:instrText xml:space="preserve"> PAGEREF _Toc205197971 \h </w:instrText>
+              <w:instrText xml:space="preserve"> PAGEREF _Toc205199525 \h </w:instrText>
             </w:r>
             <w:r>
               <w:rPr>
@@ -1090,7 +1092,7 @@
               <w14:ligatures w14:val="standardContextual"/>
             </w:rPr>
           </w:pPr>
-          <w:hyperlink w:anchor="_Toc205197972" w:history="1">
+          <w:hyperlink w:anchor="_Toc205199526" w:history="1">
             <w:r>
               <w:rPr>
                 <w:rStyle w:val="Hyperlink"/>
@@ -1118,7 +1120,7 @@
                 <w:noProof/>
                 <w:webHidden/>
               </w:rPr>
-              <w:instrText xml:space="preserve"> PAGEREF _Toc205197972 \h </w:instrText>
+              <w:instrText xml:space="preserve"> PAGEREF _Toc205199526 \h </w:instrText>
             </w:r>
             <w:r>
               <w:rPr>
@@ -1164,7 +1166,7 @@
               <w14:ligatures w14:val="standardContextual"/>
             </w:rPr>
           </w:pPr>
-          <w:hyperlink w:anchor="_Toc205197973" w:history="1">
+          <w:hyperlink w:anchor="_Toc205199527" w:history="1">
             <w:r>
               <w:rPr>
                 <w:rStyle w:val="Hyperlink"/>
@@ -1192,7 +1194,7 @@
                 <w:noProof/>
                 <w:webHidden/>
               </w:rPr>
-              <w:instrText xml:space="preserve"> PAGEREF _Toc205197973 \h </w:instrText>
+              <w:instrText xml:space="preserve"> PAGEREF _Toc205199527 \h </w:instrText>
             </w:r>
             <w:r>
               <w:rPr>
@@ -1224,6 +1226,71 @@
           </w:hyperlink>
         </w:p>
         <w:p>
+          <w:pPr>
+            <w:pStyle w:val="TOC1"/>
+            <w:tabs>
+              <w:tab w:val="right" w:leader="dot" w:pos="9350"/>
+            </w:tabs>
+            <w:rPr>
+              <w:rFonts w:eastAsiaTheme="minorEastAsia"/>
+              <w:kern w:val="2"/>
+              <w:sz w:val="24"/>
+              <w:szCs w:val="24"/>
+              <w14:ligatures w14:val="standardContextual"/>
+            </w:rPr>
+          </w:pPr>
+          <w:hyperlink w:anchor="_Toc205199528" w:history="1">
+            <w:r>
+              <w:rPr>
+                <w:rStyle w:val="Hyperlink"/>
+                <w:lang w:val="el-GR"/>
+              </w:rPr>
+              <w:t>Αναφορά Σφαλμάτων - Προτάσεις</w:t>
+            </w:r>
+            <w:r>
+              <w:rPr>
+                <w:webHidden/>
+              </w:rPr>
+              <w:tab/>
+            </w:r>
+            <w:r>
+              <w:rPr>
+                <w:webHidden/>
+              </w:rPr>
+              <w:fldChar w:fldCharType="begin"/>
+            </w:r>
+            <w:r>
+              <w:rPr>
+                <w:webHidden/>
+              </w:rPr>
+              <w:instrText xml:space="preserve"> PAGEREF _Toc205199528 \h </w:instrText>
+            </w:r>
+            <w:r>
+              <w:rPr>
+                <w:webHidden/>
+              </w:rPr>
+            </w:r>
+            <w:r>
+              <w:rPr>
+                <w:webHidden/>
+              </w:rPr>
+              <w:fldChar w:fldCharType="separate"/>
+            </w:r>
+            <w:r>
+              <w:rPr>
+                <w:webHidden/>
+              </w:rPr>
+              <w:t>16</w:t>
+            </w:r>
+            <w:r>
+              <w:rPr>
+                <w:webHidden/>
+              </w:rPr>
+              <w:fldChar w:fldCharType="end"/>
+            </w:r>
+          </w:hyperlink>
+        </w:p>
+        <w:p>
           <w:r>
             <w:rPr>
               <w:b/>
@@ -1311,7 +1378,7 @@
         </w:rPr>
       </w:pPr>
       <w:bookmarkStart w:id="0" w:name="_Toc1001"/>
-      <w:bookmarkStart w:id="1" w:name="_Toc205197959"/>
+      <w:bookmarkStart w:id="1" w:name="_Toc205199513"/>
       <w:r>
         <w:rPr>
           <w:lang w:val="el-GR"/>
@@ -1369,7 +1436,7 @@
           <w:lang w:val="el-GR"/>
         </w:rPr>
       </w:pPr>
-      <w:bookmarkStart w:id="2" w:name="_Toc205197960"/>
+      <w:bookmarkStart w:id="2" w:name="_Toc205199514"/>
       <w:r>
         <w:rPr>
           <w:lang w:val="el-GR"/>
@@ -1417,13 +1484,7 @@
         <w:rPr>
           <w:lang w:val="el-GR"/>
         </w:rPr>
-        <w:t>ή δεξί κλικ και άνοιγμα</w:t>
-      </w:r>
-      <w:r>
-        <w:rPr>
-          <w:lang w:val="el-GR"/>
-        </w:rPr>
-        <w:t xml:space="preserve"> </w:t>
+        <w:t xml:space="preserve">ή δεξί κλικ και άνοιγμα </w:t>
       </w:r>
       <w:r>
         <w:rPr>
@@ -1807,7 +1868,7 @@
           <w:lang w:val="el-GR"/>
         </w:rPr>
       </w:pPr>
-      <w:bookmarkStart w:id="3" w:name="_Toc205197961"/>
+      <w:bookmarkStart w:id="3" w:name="_Toc205199515"/>
       <w:r>
         <w:rPr>
           <w:lang w:val="el-GR"/>
@@ -2035,13 +2096,7 @@
         <w:rPr>
           <w:lang w:val="el-GR"/>
         </w:rPr>
-        <w:t>Όπως θα φαίνεται στα εξαγόμενα αρχεία</w:t>
-      </w:r>
-      <w:r>
-        <w:rPr>
-          <w:lang w:val="el-GR"/>
-        </w:rPr>
-        <w:t>. Προσοχή όχι πολύ μεγάλες διευθύνσεις, πιθανό να δημιουργηθεί πρόβλημα στη διάταξη των εξαγόμενων αρχείων.</w:t>
+        <w:t>Όπως θα φαίνεται στα εξαγόμενα αρχεία. Προσοχή όχι πολύ μεγάλες διευθύνσεις, πιθανό να δημιουργηθεί πρόβλημα στη διάταξη των εξαγόμενων αρχείων.</w:t>
       </w:r>
     </w:p>
     <w:p>
@@ -2080,13 +2135,7 @@
         <w:rPr>
           <w:lang w:val="el-GR"/>
         </w:rPr>
-        <w:t>Όπως θα φαίνεται στα εξαγόμενα αρχεία</w:t>
-      </w:r>
-      <w:r>
-        <w:rPr>
-          <w:lang w:val="el-GR"/>
-        </w:rPr>
-        <w:t xml:space="preserve"> το λογότυπο του συλλόγου</w:t>
+        <w:t>Όπως θα φαίνεται στα εξαγόμενα αρχεία το λογότυπο του συλλόγου</w:t>
       </w:r>
     </w:p>
     <w:p>
@@ -2130,13 +2179,7 @@
         <w:rPr>
           <w:lang w:val="el-GR"/>
         </w:rPr>
-        <w:t>αυτόματα</w:t>
-      </w:r>
-      <w:r>
-        <w:rPr>
-          <w:lang w:val="el-GR"/>
-        </w:rPr>
-        <w:t xml:space="preserve"> να δημιουργεί σειρά αριθμών για τις αποδείξεις. </w:t>
+        <w:t xml:space="preserve">αυτόματα να δημιουργεί σειρά αριθμών για τις αποδείξεις. </w:t>
       </w:r>
       <w:r>
         <w:rPr>
@@ -2272,7 +2315,7 @@
         </w:rPr>
       </w:pPr>
       <w:bookmarkStart w:id="4" w:name="_Toc1002"/>
-      <w:bookmarkStart w:id="5" w:name="_Toc205197962"/>
+      <w:bookmarkStart w:id="5" w:name="_Toc205199516"/>
       <w:r>
         <w:rPr>
           <w:lang w:val="el-GR"/>
@@ -2424,7 +2467,7 @@
         </w:rPr>
       </w:pPr>
       <w:bookmarkStart w:id="6" w:name="_Toc1003"/>
-      <w:bookmarkStart w:id="7" w:name="_Toc205197963"/>
+      <w:bookmarkStart w:id="7" w:name="_Toc205199517"/>
       <w:r>
         <w:rPr>
           <w:lang w:val="el-GR"/>
@@ -2503,7 +2546,7 @@
         </w:rPr>
       </w:pPr>
       <w:bookmarkStart w:id="8" w:name="_Toc1004"/>
-      <w:bookmarkStart w:id="9" w:name="_Toc205197964"/>
+      <w:bookmarkStart w:id="9" w:name="_Toc205199518"/>
       <w:r>
         <w:rPr>
           <w:lang w:val="el-GR"/>
@@ -2568,21 +2611,7 @@
           <w:u w:val="single"/>
           <w:lang w:val="el-GR"/>
         </w:rPr>
-        <w:t xml:space="preserve">Πατώντας το κουμπί </w:t>
-      </w:r>
-      <w:r>
-        <w:rPr>
-          <w:u w:val="single"/>
-          <w:lang w:val="el-GR"/>
-        </w:rPr>
-        <w:t>«Αποθήκευση»</w:t>
-      </w:r>
-      <w:r>
-        <w:rPr>
-          <w:u w:val="single"/>
-          <w:lang w:val="el-GR"/>
-        </w:rPr>
-        <w:t>, η συνδρομή θεωρείται ότι έχει καταβληθεί και το έτος κλειδώνει χωρίς δυνατότητα αλλαγής έτους.</w:t>
+        <w:t>Πατώντας το κουμπί «Αποθήκευση», η συνδρομή θεωρείται ότι έχει καταβληθεί και το έτος κλειδώνει χωρίς δυνατότητα αλλαγής έτους.</w:t>
       </w:r>
     </w:p>
     <w:p>
@@ -2608,7 +2637,6 @@
           <w:iCs/>
           <w:lang w:val="el-GR"/>
         </w:rPr>
-        <w:lastRenderedPageBreak/>
         <w:t>Παράδειγμα ολοκληρωμένης – κλειδωμένης συνδρομής</w:t>
       </w:r>
     </w:p>
@@ -2623,6 +2651,7 @@
         <w:rPr>
           <w:noProof/>
         </w:rPr>
+        <w:lastRenderedPageBreak/>
         <w:drawing>
           <wp:inline distT="0" distB="0" distL="0" distR="0" wp14:anchorId="6EF00579" wp14:editId="090EF483">
             <wp:extent cx="5943600" cy="1014095"/>
@@ -2671,31 +2700,7 @@
         <w:rPr>
           <w:lang w:val="el-GR"/>
         </w:rPr>
-        <w:t xml:space="preserve">Η εφαρμογή δίνει την δυνατότητα για εισαγωγή παρελθόντων ετών. Πατήστε «Εισαγωγή Συνδρομής», αμέσως πριν πατήσετε </w:t>
-      </w:r>
-      <w:r>
-        <w:rPr>
-          <w:lang w:val="el-GR"/>
-        </w:rPr>
-        <w:t>«Αποθήκευση»</w:t>
-      </w:r>
-      <w:r>
-        <w:rPr>
-          <w:lang w:val="el-GR"/>
-        </w:rPr>
-        <w:t xml:space="preserve"> αλλάξτε το έτος στην επιθυμητή τιμή, συμπληρώστε το ποσό και τέλος πατήστε </w:t>
-      </w:r>
-      <w:r>
-        <w:rPr>
-          <w:lang w:val="el-GR"/>
-        </w:rPr>
-        <w:t>«Αποθήκευση»</w:t>
-      </w:r>
-      <w:r>
-        <w:rPr>
-          <w:lang w:val="el-GR"/>
-        </w:rPr>
-        <w:t>.</w:t>
+        <w:t>Η εφαρμογή δίνει την δυνατότητα για εισαγωγή παρελθόντων ετών. Πατήστε «Εισαγωγή Συνδρομής», αμέσως πριν πατήσετε «Αποθήκευση» αλλάξτε το έτος στην επιθυμητή τιμή, συμπληρώστε το ποσό και τέλος πατήστε «Αποθήκευση».</w:t>
       </w:r>
       <w:r>
         <w:rPr>
@@ -2733,7 +2738,7 @@
         </w:rPr>
       </w:pPr>
       <w:bookmarkStart w:id="10" w:name="_Toc1005"/>
-      <w:bookmarkStart w:id="11" w:name="_Toc205197965"/>
+      <w:bookmarkStart w:id="11" w:name="_Toc205199519"/>
       <w:r>
         <w:rPr>
           <w:lang w:val="el-GR"/>
@@ -2872,7 +2877,7 @@
         </w:rPr>
       </w:pPr>
       <w:bookmarkStart w:id="12" w:name="_Toc1006"/>
-      <w:bookmarkStart w:id="13" w:name="_Toc205197966"/>
+      <w:bookmarkStart w:id="13" w:name="_Toc205199520"/>
       <w:r>
         <w:rPr>
           <w:lang w:val="el-GR"/>
@@ -3185,13 +3190,7 @@
         <w:rPr>
           <w:lang w:val="el-GR"/>
         </w:rPr>
-        <w:t xml:space="preserve"> ΔΑΜΙΑΝΟΣ_2025</w:t>
-      </w:r>
-      <w:r>
-        <w:rPr>
-          <w:lang w:val="el-GR"/>
-        </w:rPr>
-        <w:t>.</w:t>
+        <w:t xml:space="preserve"> ΔΑΜΙΑΝΟΣ_2025.</w:t>
       </w:r>
       <w:r>
         <w:t>pdf</w:t>
@@ -3502,7 +3501,7 @@
         </w:rPr>
       </w:pPr>
       <w:bookmarkStart w:id="14" w:name="_Toc1007"/>
-      <w:bookmarkStart w:id="15" w:name="_Toc205197967"/>
+      <w:bookmarkStart w:id="15" w:name="_Toc205199521"/>
       <w:r>
         <w:rPr>
           <w:lang w:val="el-GR"/>
@@ -3933,7 +3932,7 @@
           <w:lang w:val="el-GR"/>
         </w:rPr>
       </w:pPr>
-      <w:bookmarkStart w:id="16" w:name="_Toc205197968"/>
+      <w:bookmarkStart w:id="16" w:name="_Toc205199522"/>
       <w:r>
         <w:rPr>
           <w:lang w:val="el-GR"/>
@@ -4211,7 +4210,7 @@
           <w:lang w:val="el-GR"/>
         </w:rPr>
       </w:pPr>
-      <w:bookmarkStart w:id="17" w:name="_Toc205197969"/>
+      <w:bookmarkStart w:id="17" w:name="_Toc205199523"/>
       <w:r>
         <w:rPr>
           <w:lang w:val="el-GR"/>
@@ -4377,6 +4376,9 @@
           <w:ilvl w:val="0"/>
           <w:numId w:val="35"/>
         </w:numPr>
+        <w:rPr>
+          <w:lang w:val="el-GR"/>
+        </w:rPr>
       </w:pPr>
       <w:r>
         <w:rPr>
@@ -4650,7 +4652,7 @@
           <w:lang w:val="el-GR"/>
         </w:rPr>
       </w:pPr>
-      <w:bookmarkStart w:id="18" w:name="_Toc205197970"/>
+      <w:bookmarkStart w:id="18" w:name="_Toc205199524"/>
       <w:r>
         <w:rPr>
           <w:lang w:val="el-GR"/>
@@ -4768,7 +4770,7 @@
           <w:lang w:val="el-GR"/>
         </w:rPr>
       </w:pPr>
-      <w:bookmarkStart w:id="19" w:name="_Toc205197971"/>
+      <w:bookmarkStart w:id="19" w:name="_Toc205199525"/>
       <w:r>
         <w:rPr>
           <w:lang w:val="el-GR"/>
@@ -4887,7 +4889,7 @@
           <w:lang w:val="el-GR"/>
         </w:rPr>
       </w:pPr>
-      <w:bookmarkStart w:id="20" w:name="_Toc205197972"/>
+      <w:bookmarkStart w:id="20" w:name="_Toc205199526"/>
       <w:r>
         <w:rPr>
           <w:lang w:val="el-GR"/>
@@ -5038,7 +5040,7 @@
           <w:lang w:val="el-GR"/>
         </w:rPr>
       </w:pPr>
-      <w:bookmarkStart w:id="21" w:name="_Toc205197973"/>
+      <w:bookmarkStart w:id="21" w:name="_Toc205199527"/>
       <w:r>
         <w:rPr>
           <w:lang w:val="el-GR"/>
@@ -5129,17 +5131,378 @@
         <w:rPr>
           <w:lang w:val="el-GR"/>
         </w:rPr>
-        <w:t xml:space="preserve">, όπως περιγράφεται στο </w:t>
-      </w:r>
-      <w:r>
-        <w:rPr>
-          <w:lang w:val="el-GR"/>
-        </w:rPr>
-        <w:t>«Δημιουργία Αντιγράφου Ασφαλείας»</w:t>
+        <w:t>, όπως περιγράφεται στο «Δημιουργία Αντιγράφου Ασφαλείας»</w:t>
+      </w:r>
+    </w:p>
+    <w:p>
+      <w:pPr>
+        <w:rPr>
+          <w:lang w:val="el-GR"/>
+        </w:rPr>
+      </w:pPr>
+    </w:p>
+    <w:p>
+      <w:pPr>
+        <w:pStyle w:val="Heading1"/>
+        <w:rPr>
+          <w:lang w:val="el-GR"/>
+        </w:rPr>
+      </w:pPr>
+      <w:bookmarkStart w:id="22" w:name="_Toc205199528"/>
+      <w:r>
+        <w:rPr>
+          <w:lang w:val="el-GR"/>
+        </w:rPr>
+        <w:t>Α</w:t>
+      </w:r>
+      <w:r>
+        <w:rPr>
+          <w:lang w:val="el-GR"/>
+        </w:rPr>
+        <w:t>ναφορά Σφαλμάτων - Προτάσεις</w:t>
+      </w:r>
+      <w:bookmarkEnd w:id="22"/>
+    </w:p>
+    <w:p>
+      <w:pPr>
+        <w:rPr>
+          <w:noProof/>
+          <w:lang w:val="el-GR"/>
+        </w:rPr>
+      </w:pPr>
+      <w:r>
+        <w:rPr>
+          <w:lang w:val="el-GR"/>
+        </w:rPr>
+        <w:t xml:space="preserve">Επισκεφτείτε την εφαρμογή </w:t>
+      </w:r>
+      <w:proofErr w:type="spellStart"/>
+      <w:r>
+        <w:t>Github</w:t>
+      </w:r>
+      <w:proofErr w:type="spellEnd"/>
+      <w:r>
+        <w:rPr>
+          <w:lang w:val="el-GR"/>
+        </w:rPr>
+        <w:t xml:space="preserve"> στη διεύθυνση </w:t>
+      </w:r>
+      <w:hyperlink r:id="rId39" w:history="1">
+        <w:r>
+          <w:rPr>
+            <w:rStyle w:val="Hyperlink"/>
+            <w:lang w:val="el-GR"/>
+          </w:rPr>
+          <w:t>https://github.com/stef-k/SYLOGOS</w:t>
+        </w:r>
+      </w:hyperlink>
+      <w:r>
+        <w:rPr>
+          <w:lang w:val="el-GR"/>
+        </w:rPr>
+        <w:t xml:space="preserve"> στο μενού με τους συνδέσμους, θα δείτε «</w:t>
+      </w:r>
+      <w:r>
+        <w:t>Issues</w:t>
+      </w:r>
+      <w:r>
+        <w:rPr>
+          <w:lang w:val="el-GR"/>
+        </w:rPr>
+        <w:t>», πατήστε εκεί. Στη σελίδα που θα μεταφερθείτε, θα δείτε το κουμπί «</w:t>
+      </w:r>
+      <w:r>
+        <w:t>New</w:t>
+      </w:r>
+      <w:r>
+        <w:rPr>
+          <w:lang w:val="el-GR"/>
+        </w:rPr>
+        <w:t xml:space="preserve"> </w:t>
+      </w:r>
+      <w:r>
+        <w:t>Issue</w:t>
+      </w:r>
+      <w:r>
+        <w:rPr>
+          <w:lang w:val="el-GR"/>
+        </w:rPr>
+        <w:t>», πατήστε και στα πεδία που θα εμφανιστούν εισάγετε: τον περιγραφικό τίτλο του προβλήματος ή πρότασης και στο πεδίο κυρίους κειμένου αναλυτικά το πρόβλημα ή πρόταση σας. Και πατήστε «</w:t>
+      </w:r>
+      <w:r>
+        <w:t>Create</w:t>
+      </w:r>
+      <w:r>
+        <w:rPr>
+          <w:lang w:val="el-GR"/>
+        </w:rPr>
+        <w:t>», όπως φαίνεται στις παρακάτω εικόνες:</w:t>
+      </w:r>
+      <w:r>
+        <w:rPr>
+          <w:lang w:val="el-GR"/>
+        </w:rPr>
+        <w:br/>
+      </w:r>
+      <w:r>
+        <w:rPr>
+          <w:lang w:val="el-GR"/>
+        </w:rPr>
+        <w:br/>
+      </w:r>
+    </w:p>
+    <w:p>
+      <w:pPr>
+        <w:rPr>
+          <w:lang w:val="el-GR"/>
+        </w:rPr>
+      </w:pPr>
+      <w:r>
+        <w:rPr>
+          <w:noProof/>
+        </w:rPr>
+        <w:lastRenderedPageBreak/>
+        <w:drawing>
+          <wp:inline distT="0" distB="0" distL="0" distR="0" wp14:anchorId="777BA8A0" wp14:editId="069A12DB">
+            <wp:extent cx="5943600" cy="996286"/>
+            <wp:effectExtent l="0" t="0" r="0" b="0"/>
+            <wp:docPr id="779536773" name="Picture 1"/>
+            <wp:cNvGraphicFramePr>
+              <a:graphicFrameLocks xmlns:a="http://schemas.openxmlformats.org/drawingml/2006/main" noChangeAspect="1"/>
+            </wp:cNvGraphicFramePr>
+            <a:graphic xmlns:a="http://schemas.openxmlformats.org/drawingml/2006/main">
+              <a:graphicData uri="http://schemas.openxmlformats.org/drawingml/2006/picture">
+                <pic:pic xmlns:pic="http://schemas.openxmlformats.org/drawingml/2006/picture">
+                  <pic:nvPicPr>
+                    <pic:cNvPr id="779536773" name=""/>
+                    <pic:cNvPicPr/>
+                  </pic:nvPicPr>
+                  <pic:blipFill rotWithShape="1">
+                    <a:blip r:embed="rId40"/>
+                    <a:srcRect b="64861"/>
+                    <a:stretch>
+                      <a:fillRect/>
+                    </a:stretch>
+                  </pic:blipFill>
+                  <pic:spPr bwMode="auto">
+                    <a:xfrm>
+                      <a:off x="0" y="0"/>
+                      <a:ext cx="5943600" cy="996286"/>
+                    </a:xfrm>
+                    <a:prstGeom prst="rect">
+                      <a:avLst/>
+                    </a:prstGeom>
+                    <a:ln>
+                      <a:noFill/>
+                    </a:ln>
+                    <a:extLst>
+                      <a:ext uri="{53640926-AAD7-44D8-BBD7-CCE9431645EC}">
+                        <a14:shadowObscured xmlns:a14="http://schemas.microsoft.com/office/drawing/2010/main"/>
+                      </a:ext>
+                    </a:extLst>
+                  </pic:spPr>
+                </pic:pic>
+              </a:graphicData>
+            </a:graphic>
+          </wp:inline>
+        </w:drawing>
+      </w:r>
+    </w:p>
+    <w:p>
+      <w:pPr>
+        <w:rPr>
+          <w:lang w:val="el-GR"/>
+        </w:rPr>
+      </w:pPr>
+    </w:p>
+    <w:p>
+      <w:pPr>
+        <w:rPr>
+          <w:lang w:val="el-GR"/>
+        </w:rPr>
+      </w:pPr>
+      <w:r>
+        <w:rPr>
+          <w:noProof/>
+        </w:rPr>
+        <w:drawing>
+          <wp:inline distT="0" distB="0" distL="0" distR="0" wp14:anchorId="0214B684" wp14:editId="710ABB4A">
+            <wp:extent cx="5943600" cy="1515110"/>
+            <wp:effectExtent l="0" t="0" r="0" b="8890"/>
+            <wp:docPr id="227699212" name="Picture 1"/>
+            <wp:cNvGraphicFramePr>
+              <a:graphicFrameLocks xmlns:a="http://schemas.openxmlformats.org/drawingml/2006/main" noChangeAspect="1"/>
+            </wp:cNvGraphicFramePr>
+            <a:graphic xmlns:a="http://schemas.openxmlformats.org/drawingml/2006/main">
+              <a:graphicData uri="http://schemas.openxmlformats.org/drawingml/2006/picture">
+                <pic:pic xmlns:pic="http://schemas.openxmlformats.org/drawingml/2006/picture">
+                  <pic:nvPicPr>
+                    <pic:cNvPr id="227699212" name=""/>
+                    <pic:cNvPicPr/>
+                  </pic:nvPicPr>
+                  <pic:blipFill>
+                    <a:blip r:embed="rId41"/>
+                    <a:stretch>
+                      <a:fillRect/>
+                    </a:stretch>
+                  </pic:blipFill>
+                  <pic:spPr>
+                    <a:xfrm>
+                      <a:off x="0" y="0"/>
+                      <a:ext cx="5943600" cy="1515110"/>
+                    </a:xfrm>
+                    <a:prstGeom prst="rect">
+                      <a:avLst/>
+                    </a:prstGeom>
+                  </pic:spPr>
+                </pic:pic>
+              </a:graphicData>
+            </a:graphic>
+          </wp:inline>
+        </w:drawing>
+      </w:r>
+    </w:p>
+    <w:p>
+      <w:pPr>
+        <w:rPr>
+          <w:lang w:val="el-GR"/>
+        </w:rPr>
+      </w:pPr>
+    </w:p>
+    <w:p>
+      <w:pPr>
+        <w:rPr>
+          <w:lang w:val="el-GR"/>
+        </w:rPr>
+      </w:pPr>
+      <w:r>
+        <w:rPr>
+          <w:noProof/>
+        </w:rPr>
+        <w:drawing>
+          <wp:inline distT="0" distB="0" distL="0" distR="0" wp14:anchorId="6CF6354A" wp14:editId="5C4BBDCF">
+            <wp:extent cx="5943600" cy="2848610"/>
+            <wp:effectExtent l="0" t="0" r="0" b="8890"/>
+            <wp:docPr id="1531906097" name="Picture 1"/>
+            <wp:cNvGraphicFramePr>
+              <a:graphicFrameLocks xmlns:a="http://schemas.openxmlformats.org/drawingml/2006/main" noChangeAspect="1"/>
+            </wp:cNvGraphicFramePr>
+            <a:graphic xmlns:a="http://schemas.openxmlformats.org/drawingml/2006/main">
+              <a:graphicData uri="http://schemas.openxmlformats.org/drawingml/2006/picture">
+                <pic:pic xmlns:pic="http://schemas.openxmlformats.org/drawingml/2006/picture">
+                  <pic:nvPicPr>
+                    <pic:cNvPr id="1531906097" name=""/>
+                    <pic:cNvPicPr/>
+                  </pic:nvPicPr>
+                  <pic:blipFill>
+                    <a:blip r:embed="rId42"/>
+                    <a:stretch>
+                      <a:fillRect/>
+                    </a:stretch>
+                  </pic:blipFill>
+                  <pic:spPr>
+                    <a:xfrm>
+                      <a:off x="0" y="0"/>
+                      <a:ext cx="5943600" cy="2848610"/>
+                    </a:xfrm>
+                    <a:prstGeom prst="rect">
+                      <a:avLst/>
+                    </a:prstGeom>
+                  </pic:spPr>
+                </pic:pic>
+              </a:graphicData>
+            </a:graphic>
+          </wp:inline>
+        </w:drawing>
+      </w:r>
+    </w:p>
+    <w:p>
+      <w:pPr>
+        <w:rPr>
+          <w:lang w:val="el-GR"/>
+        </w:rPr>
+      </w:pPr>
+      <w:r>
+        <w:rPr>
+          <w:lang w:val="el-GR"/>
+        </w:rPr>
+        <w:br w:type="page"/>
+      </w:r>
+    </w:p>
+    <w:p>
+      <w:pPr>
+        <w:rPr>
+          <w:lang w:val="el-GR"/>
+        </w:rPr>
+      </w:pPr>
+      <w:r>
+        <w:rPr>
+          <w:lang w:val="el-GR"/>
+        </w:rPr>
+        <w:lastRenderedPageBreak/>
+        <w:t>Εναλλακτικά, μπορείτε να μεταβείτε στη παραπάνω σελίδα, από το κύριο μενού της εφαρμογής ΒΟΗΘΕΙΑ – ΠΛΗΡΟΦΟΡΙΕΣ</w:t>
+      </w:r>
+      <w:r>
+        <w:rPr>
+          <w:lang w:val="el-GR"/>
+        </w:rPr>
+        <w:t xml:space="preserve"> και τέλος να ακολουθήσετε τα παραπάνω βήματα για τη δημιουργία αναφοράς σφάλματος ή προτάσεως.</w:t>
+      </w:r>
+      <w:r>
+        <w:rPr>
+          <w:lang w:val="el-GR"/>
+        </w:rPr>
+        <w:br/>
+      </w:r>
+      <w:r>
+        <w:rPr>
+          <w:lang w:val="el-GR"/>
+        </w:rPr>
+        <w:br/>
+      </w:r>
+      <w:r>
+        <w:rPr>
+          <w:noProof/>
+        </w:rPr>
+        <w:drawing>
+          <wp:inline distT="0" distB="0" distL="0" distR="0" wp14:anchorId="42D87D1D" wp14:editId="0644881F">
+            <wp:extent cx="4667250" cy="2857500"/>
+            <wp:effectExtent l="0" t="0" r="0" b="0"/>
+            <wp:docPr id="238765011" name="Picture 1"/>
+            <wp:cNvGraphicFramePr>
+              <a:graphicFrameLocks xmlns:a="http://schemas.openxmlformats.org/drawingml/2006/main" noChangeAspect="1"/>
+            </wp:cNvGraphicFramePr>
+            <a:graphic xmlns:a="http://schemas.openxmlformats.org/drawingml/2006/main">
+              <a:graphicData uri="http://schemas.openxmlformats.org/drawingml/2006/picture">
+                <pic:pic xmlns:pic="http://schemas.openxmlformats.org/drawingml/2006/picture">
+                  <pic:nvPicPr>
+                    <pic:cNvPr id="238765011" name=""/>
+                    <pic:cNvPicPr/>
+                  </pic:nvPicPr>
+                  <pic:blipFill>
+                    <a:blip r:embed="rId43"/>
+                    <a:stretch>
+                      <a:fillRect/>
+                    </a:stretch>
+                  </pic:blipFill>
+                  <pic:spPr>
+                    <a:xfrm>
+                      <a:off x="0" y="0"/>
+                      <a:ext cx="4667250" cy="2857500"/>
+                    </a:xfrm>
+                    <a:prstGeom prst="rect">
+                      <a:avLst/>
+                    </a:prstGeom>
+                  </pic:spPr>
+                </pic:pic>
+              </a:graphicData>
+            </a:graphic>
+          </wp:inline>
+        </w:drawing>
       </w:r>
     </w:p>
     <w:sectPr>
-      <w:footerReference w:type="default" r:id="rId39"/>
+      <w:footerReference w:type="default" r:id="rId44"/>
       <w:pgSz w:w="12240" w:h="15840"/>
       <w:pgMar w:top="1440" w:right="1440" w:bottom="1440" w:left="1440" w:header="288" w:footer="720" w:gutter="0"/>
       <w:pgNumType w:start="1"/>
@@ -5231,7 +5594,40 @@
   <w:p>
     <w:pPr>
       <w:pStyle w:val="Footer"/>
+      <w:jc w:val="center"/>
+      <w:rPr>
+        <w:rFonts w:ascii="Consolas" w:hAnsi="Consolas"/>
+        <w:sz w:val="16"/>
+        <w:szCs w:val="16"/>
+      </w:rPr>
     </w:pPr>
+    <w:r>
+      <w:rPr>
+        <w:rFonts w:ascii="Consolas" w:hAnsi="Consolas"/>
+        <w:sz w:val="16"/>
+        <w:szCs w:val="16"/>
+      </w:rPr>
+      <w:t>©2025</w:t>
+    </w:r>
+    <w:r>
+      <w:rPr>
+        <w:rFonts w:ascii="Consolas" w:hAnsi="Consolas"/>
+        <w:sz w:val="16"/>
+        <w:szCs w:val="16"/>
+      </w:rPr>
+      <w:t xml:space="preserve"> | Stef Karyotidis </w:t>
+    </w:r>
+    <w:hyperlink r:id="rId1" w:history="1">
+      <w:r>
+        <w:rPr>
+          <w:rStyle w:val="Hyperlink"/>
+          <w:rFonts w:ascii="Consolas" w:hAnsi="Consolas"/>
+          <w:sz w:val="16"/>
+          <w:szCs w:val="16"/>
+        </w:rPr>
+        <w:t>https://stefk.me</w:t>
+      </w:r>
+    </w:hyperlink>
   </w:p>
 </w:ftr>
 </file>
@@ -32709,6 +33105,25 @@
 </file>
 
 <file path=customXml/item1.xml><?xml version="1.0" encoding="utf-8"?>
+<p:properties xmlns:p="http://schemas.microsoft.com/office/2006/metadata/properties" xmlns:xsi="http://www.w3.org/2001/XMLSchema-instance" xmlns:pc="http://schemas.microsoft.com/office/infopath/2007/PartnerControls">
+  <documentManagement>
+    <_ip_UnifiedCompliancePolicyUIAction xmlns="http://schemas.microsoft.com/sharepoint/v3" xsi:nil="true"/>
+    <Image xmlns="71af3243-3dd4-4a8d-8c0d-dd76da1f02a5">
+      <Url xsi:nil="true"/>
+      <Description xsi:nil="true"/>
+    </Image>
+    <Status xmlns="71af3243-3dd4-4a8d-8c0d-dd76da1f02a5">Not started</Status>
+    <_ip_UnifiedCompliancePolicyProperties xmlns="http://schemas.microsoft.com/sharepoint/v3" xsi:nil="true"/>
+    <ImageTagsTaxHTField xmlns="71af3243-3dd4-4a8d-8c0d-dd76da1f02a5">
+      <Terms xmlns="http://schemas.microsoft.com/office/infopath/2007/PartnerControls"/>
+    </ImageTagsTaxHTField>
+    <TaxCatchAll xmlns="230e9df3-be65-4c73-a93b-d1236ebd677e"/>
+    <MediaServiceKeyPoints xmlns="71af3243-3dd4-4a8d-8c0d-dd76da1f02a5" xsi:nil="true"/>
+  </documentManagement>
+</p:properties>
+</file>
+
+<file path=customXml/item2.xml><?xml version="1.0" encoding="utf-8"?>
 <ct:contentTypeSchema xmlns:ct="http://schemas.microsoft.com/office/2006/metadata/contentType" xmlns:ma="http://schemas.microsoft.com/office/2006/metadata/properties/metaAttributes" ct:_="" ma:_="" ma:contentTypeName="Document" ma:contentTypeID="0x01010079F111ED35F8CC479449609E8A0923A6" ma:contentTypeVersion="20" ma:contentTypeDescription="Create a new document." ma:contentTypeScope="" ma:versionID="1267097ee5f5874adfcc408041ae252e">
   <xsd:schema xmlns:xsd="http://www.w3.org/2001/XMLSchema" xmlns:xs="http://www.w3.org/2001/XMLSchema" xmlns:p="http://schemas.microsoft.com/office/2006/metadata/properties" xmlns:ns1="http://schemas.microsoft.com/sharepoint/v3" xmlns:ns2="71af3243-3dd4-4a8d-8c0d-dd76da1f02a5" xmlns:ns3="16c05727-aa75-4e4a-9b5f-8a80a1165891" xmlns:ns4="230e9df3-be65-4c73-a93b-d1236ebd677e" targetNamespace="http://schemas.microsoft.com/office/2006/metadata/properties" ma:root="true" ma:fieldsID="395891a93df65b14727750f2c06c306c" ns1:_="" ns2:_="" ns3:_="" ns4:_="">
     <xsd:import namespace="http://schemas.microsoft.com/sharepoint/v3"/>
@@ -32984,30 +33399,7 @@
 </ct:contentTypeSchema>
 </file>
 
-<file path=customXml/item2.xml><?xml version="1.0" encoding="utf-8"?>
-<p:properties xmlns:p="http://schemas.microsoft.com/office/2006/metadata/properties" xmlns:xsi="http://www.w3.org/2001/XMLSchema-instance" xmlns:pc="http://schemas.microsoft.com/office/infopath/2007/PartnerControls">
-  <documentManagement>
-    <_ip_UnifiedCompliancePolicyUIAction xmlns="http://schemas.microsoft.com/sharepoint/v3" xsi:nil="true"/>
-    <Image xmlns="71af3243-3dd4-4a8d-8c0d-dd76da1f02a5">
-      <Url xsi:nil="true"/>
-      <Description xsi:nil="true"/>
-    </Image>
-    <Status xmlns="71af3243-3dd4-4a8d-8c0d-dd76da1f02a5">Not started</Status>
-    <_ip_UnifiedCompliancePolicyProperties xmlns="http://schemas.microsoft.com/sharepoint/v3" xsi:nil="true"/>
-    <ImageTagsTaxHTField xmlns="71af3243-3dd4-4a8d-8c0d-dd76da1f02a5">
-      <Terms xmlns="http://schemas.microsoft.com/office/infopath/2007/PartnerControls"/>
-    </ImageTagsTaxHTField>
-    <TaxCatchAll xmlns="230e9df3-be65-4c73-a93b-d1236ebd677e"/>
-    <MediaServiceKeyPoints xmlns="71af3243-3dd4-4a8d-8c0d-dd76da1f02a5" xsi:nil="true"/>
-  </documentManagement>
-</p:properties>
-</file>
-
 <file path=customXml/item3.xml><?xml version="1.0" encoding="utf-8"?>
-<b:Sources xmlns:b="http://schemas.openxmlformats.org/officeDocument/2006/bibliography" xmlns="http://schemas.openxmlformats.org/officeDocument/2006/bibliography" SelectedStyle="\APASixthEditionOfficeOnline.xsl" StyleName="APA" Version="6"/>
-</file>
-
-<file path=customXml/item4.xml><?xml version="1.0" encoding="utf-8"?>
 <?mso-contentType ?>
 <FormTemplates xmlns="http://schemas.microsoft.com/sharepoint/v3/contenttype/forms">
   <Display>DocumentLibraryForm</Display>
@@ -33016,7 +33408,23 @@
 </FormTemplates>
 </file>
 
+<file path=customXml/item4.xml><?xml version="1.0" encoding="utf-8"?>
+<b:Sources xmlns:b="http://schemas.openxmlformats.org/officeDocument/2006/bibliography" xmlns="http://schemas.openxmlformats.org/officeDocument/2006/bibliography" SelectedStyle="\APASixthEditionOfficeOnline.xsl" StyleName="APA" Version="6"/>
+</file>
+
 <file path=customXml/itemProps1.xml><?xml version="1.0" encoding="utf-8"?>
+<ds:datastoreItem xmlns:ds="http://schemas.openxmlformats.org/officeDocument/2006/customXml" ds:itemID="{91E7373D-5DCA-4092-912F-7D030B4FE61E}">
+  <ds:schemaRefs>
+    <ds:schemaRef ds:uri="http://schemas.microsoft.com/office/2006/metadata/properties"/>
+    <ds:schemaRef ds:uri="http://schemas.microsoft.com/office/infopath/2007/PartnerControls"/>
+    <ds:schemaRef ds:uri="http://schemas.microsoft.com/sharepoint/v3"/>
+    <ds:schemaRef ds:uri="71af3243-3dd4-4a8d-8c0d-dd76da1f02a5"/>
+    <ds:schemaRef ds:uri="230e9df3-be65-4c73-a93b-d1236ebd677e"/>
+  </ds:schemaRefs>
+</ds:datastoreItem>
+</file>
+
+<file path=customXml/itemProps2.xml><?xml version="1.0" encoding="utf-8"?>
 <ds:datastoreItem xmlns:ds="http://schemas.openxmlformats.org/officeDocument/2006/customXml" ds:itemID="{B15B1B51-5121-472B-BA9E-DC61343F5AF6}">
   <ds:schemaRefs>
     <ds:schemaRef ds:uri="http://schemas.microsoft.com/office/2006/metadata/contentType"/>
@@ -33037,30 +33445,18 @@
 </ds:datastoreItem>
 </file>
 
-<file path=customXml/itemProps2.xml><?xml version="1.0" encoding="utf-8"?>
-<ds:datastoreItem xmlns:ds="http://schemas.openxmlformats.org/officeDocument/2006/customXml" ds:itemID="{91E7373D-5DCA-4092-912F-7D030B4FE61E}">
+<file path=customXml/itemProps3.xml><?xml version="1.0" encoding="utf-8"?>
+<ds:datastoreItem xmlns:ds="http://schemas.openxmlformats.org/officeDocument/2006/customXml" ds:itemID="{878A3276-187E-405F-966A-BDA24FF7DCFF}">
   <ds:schemaRefs>
-    <ds:schemaRef ds:uri="http://schemas.microsoft.com/office/2006/metadata/properties"/>
-    <ds:schemaRef ds:uri="http://schemas.microsoft.com/office/infopath/2007/PartnerControls"/>
-    <ds:schemaRef ds:uri="http://schemas.microsoft.com/sharepoint/v3"/>
-    <ds:schemaRef ds:uri="71af3243-3dd4-4a8d-8c0d-dd76da1f02a5"/>
-    <ds:schemaRef ds:uri="230e9df3-be65-4c73-a93b-d1236ebd677e"/>
+    <ds:schemaRef ds:uri="http://schemas.microsoft.com/sharepoint/v3/contenttype/forms"/>
   </ds:schemaRefs>
 </ds:datastoreItem>
 </file>
 
-<file path=customXml/itemProps3.xml><?xml version="1.0" encoding="utf-8"?>
+<file path=customXml/itemProps4.xml><?xml version="1.0" encoding="utf-8"?>
 <ds:datastoreItem xmlns:ds="http://schemas.openxmlformats.org/officeDocument/2006/customXml" ds:itemID="{9EAA2E9E-4E47-497B-A79A-B397382D8E2F}">
   <ds:schemaRefs>
     <ds:schemaRef ds:uri="http://schemas.openxmlformats.org/officeDocument/2006/bibliography"/>
   </ds:schemaRefs>
 </ds:datastoreItem>
-</file>
-
-<file path=customXml/itemProps4.xml><?xml version="1.0" encoding="utf-8"?>
-<ds:datastoreItem xmlns:ds="http://schemas.openxmlformats.org/officeDocument/2006/customXml" ds:itemID="{878A3276-187E-405F-966A-BDA24FF7DCFF}">
-  <ds:schemaRefs>
-    <ds:schemaRef ds:uri="http://schemas.microsoft.com/sharepoint/v3/contenttype/forms"/>
-  </ds:schemaRefs>
-</ds:datastoreItem>
 </file>
</xml_diff>